<commit_message>
fix(word-diff): use AttributedString flow to fix line wrapping in inline diff highlights
</commit_message>
<xml_diff>
--- a/macos/Assets/工作日报1.docx
+++ b/macos/Assets/工作日报1.docx
@@ -117,7 +117,21 @@
           <w:shd w:val="clear" w:fill="FFFFFF"/>
           <w:lang w:eastAsia="zh-CN"/>
         </w:rPr>
-        <w:t>今天重点工作事项</w:t>
+        <w:t>今天重点工作事</w:t>
+      </w:r>
+      <w:r>
+        <w:rPr>
+          <w:rFonts w:hint="eastAsia" w:ascii="Microsoft YaHei" w:hAnsi="Microsoft YaHei" w:cs="Microsoft YaHei"/>
+          <w:i w:val="0"/>
+          <w:caps w:val="0"/>
+          <w:color w:val="1F2329"/>
+          <w:spacing w:val="0"/>
+          <w:sz w:val="24"/>
+          <w:szCs w:val="20"/>
+          <w:shd w:val="clear" w:fill="FFFFFF"/>
+          <w:lang w:val="en-US" w:eastAsia="zh-CN"/>
+        </w:rPr>
+        <w:t>2</w:t>
       </w:r>
     </w:p>
     <w:p>
@@ -166,29 +180,29 @@
         </w:rPr>
         <w:t>2</w:t>
       </w:r>
+      <w:r>
+        <w:rPr>
+          <w:rFonts w:hint="eastAsia" w:ascii="Microsoft YaHei" w:hAnsi="Microsoft YaHei" w:eastAsia="Microsoft YaHei" w:cs="Microsoft YaHei"/>
+          <w:b w:val="0"/>
+          <w:bCs w:val="0"/>
+          <w:sz w:val="20"/>
+          <w:szCs w:val="16"/>
+        </w:rPr>
+        <w:br w:type="textWrapping"/>
+      </w:r>
+      <w:r>
+        <w:rPr>
+          <w:rFonts w:hint="eastAsia" w:ascii="Microsoft YaHei" w:hAnsi="Microsoft YaHei" w:eastAsia="Microsoft YaHei" w:cs="Microsoft YaHei"/>
+          <w:b w:val="0"/>
+          <w:bCs w:val="0"/>
+          <w:color w:val="8F959E"/>
+          <w:sz w:val="20"/>
+          <w:szCs w:val="16"/>
+        </w:rPr>
+        <w:t>你可以在描述中粘贴相关工</w:t>
+      </w:r>
       <w:bookmarkStart w:id="0" w:name="_GoBack"/>
       <w:bookmarkEnd w:id="0"/>
-      <w:r>
-        <w:rPr>
-          <w:rFonts w:hint="eastAsia" w:ascii="Microsoft YaHei" w:hAnsi="Microsoft YaHei" w:eastAsia="Microsoft YaHei" w:cs="Microsoft YaHei"/>
-          <w:b w:val="0"/>
-          <w:bCs w:val="0"/>
-          <w:sz w:val="20"/>
-          <w:szCs w:val="16"/>
-        </w:rPr>
-        <w:br w:type="textWrapping"/>
-      </w:r>
-      <w:r>
-        <w:rPr>
-          <w:rFonts w:hint="eastAsia" w:ascii="Microsoft YaHei" w:hAnsi="Microsoft YaHei" w:eastAsia="Microsoft YaHei" w:cs="Microsoft YaHei"/>
-          <w:b w:val="0"/>
-          <w:bCs w:val="0"/>
-          <w:color w:val="8F959E"/>
-          <w:sz w:val="20"/>
-          <w:szCs w:val="16"/>
-        </w:rPr>
-        <w:t>你可以在描述中粘贴相关工作事项</w:t>
-      </w:r>
     </w:p>
     <w:p>
       <w:pPr>

</xml_diff>